<commit_message>
Add pedal and website connections to the decisions list
Co-Authored-By: Claude Opus 5.5 <noreply@anthropic.com>
</commit_message>
<xml_diff>
--- a/Greywire Decisions to Make.docx
+++ b/Greywire Decisions to Make.docx
@@ -31,7 +31,7 @@
         <w:rPr>
           <w:b w:val="0"/>
         </w:rPr>
-        <w:t>This list holds 84 decisions, 62 of them still open, from which pedal to build next to which countries to sell in. This list names each one so the surveys can ask about the ones musicians can actually help with.</w:t>
+        <w:t>This list holds 102 decisions, 80 of them still open, from which pedal to build next to which countries to sell in. This list names each one so the surveys can ask about the ones musicians can actually help with.</w:t>
       </w:r>
     </w:p>
     <w:p>
@@ -9223,6 +9223,1718 @@
         <w:t>The privacy promise on the Your Opinion page applies to every new survey: no names, no raw IP addresses, and region only, never a city or address.</w:t>
       </w:r>
     </w:p>
+    <w:p>
+      <w:pPr>
+        <w:pStyle w:val="Heading1"/>
+      </w:pPr>
+      <w:r>
+        <w:t>13. Pedal and website connections</w:t>
+      </w:r>
+    </w:p>
+    <w:p>
+      <w:r>
+        <w:rPr>
+          <w:b w:val="0"/>
+        </w:rPr>
+        <w:t xml:space="preserve">These 18 decisions from the 2026-10-30 brainstorm cover how the pedals and the website could work together. Every connection goes through a phone or computer, because the pedals have no Wi-Fi, and stage use must never depend on the internet.</w:t>
+      </w:r>
+    </w:p>
+    <w:p>
+      <w:r>
+        <w:rPr>
+          <w:b w:val="0"/>
+        </w:rPr>
+        <w:t xml:space="preserve">Claude's suggestion, not yet decided: start with 13.1 and 13.4, then 13.11. None of these has a survey question yet, and section 12's plan doesn't include them.</w:t>
+      </w:r>
+    </w:p>
+    <w:tbl>
+      <w:tblPr>
+        <w:tblStyle w:val="TableGrid"/>
+        <w:tblW w:type="auto" w:w="0"/>
+        <w:tblLook w:firstColumn="1" w:firstRow="1" w:lastColumn="0" w:lastRow="0" w:noHBand="0" w:noVBand="1" w:val="04A0"/>
+      </w:tblPr>
+      <w:tblGrid>
+        <w:gridCol w:w="2304"/>
+        <w:gridCol w:w="2304"/>
+        <w:gridCol w:w="2304"/>
+        <w:gridCol w:w="2304"/>
+        <w:gridCol w:w="2304"/>
+        <w:gridCol w:w="2304"/>
+      </w:tblGrid>
+      <w:tr>
+        <w:trPr>
+          <w:tblHeader w:val="true"/>
+        </w:trPr>
+        <w:tc>
+          <w:tcPr>
+            <w:tcW w:type="dxa" w:w="720"/>
+            <w:shd w:val="clear" w:color="auto" w:fill="3A3F47"/>
+          </w:tcPr>
+          <w:p>
+            <w:r>
+              <w:rPr>
+                <w:b/>
+                <w:color w:val="FFFFFF"/>
+                <w:sz w:val="19"/>
+              </w:rPr>
+              <w:t>#</w:t>
+            </w:r>
+          </w:p>
+        </w:tc>
+        <w:tc>
+          <w:tcPr>
+            <w:tcW w:type="dxa" w:w="2592"/>
+            <w:shd w:val="clear" w:color="auto" w:fill="3A3F47"/>
+          </w:tcPr>
+          <w:p>
+            <w:r>
+              <w:rPr>
+                <w:b/>
+                <w:color w:val="FFFFFF"/>
+                <w:sz w:val="19"/>
+              </w:rPr>
+              <w:t>Decision</w:t>
+            </w:r>
+          </w:p>
+        </w:tc>
+        <w:tc>
+          <w:tcPr>
+            <w:tcW w:type="dxa" w:w="3888"/>
+            <w:shd w:val="clear" w:color="auto" w:fill="3A3F47"/>
+          </w:tcPr>
+          <w:p>
+            <w:r>
+              <w:rPr>
+                <w:b/>
+                <w:color w:val="FFFFFF"/>
+                <w:sz w:val="19"/>
+              </w:rPr>
+              <w:t>Options</w:t>
+            </w:r>
+          </w:p>
+        </w:tc>
+        <w:tc>
+          <w:tcPr>
+            <w:tcW w:type="dxa" w:w="1152"/>
+            <w:shd w:val="clear" w:color="auto" w:fill="3A3F47"/>
+          </w:tcPr>
+          <w:p>
+            <w:r>
+              <w:rPr>
+                <w:b/>
+                <w:color w:val="FFFFFF"/>
+                <w:sz w:val="19"/>
+              </w:rPr>
+              <w:t>Status</w:t>
+            </w:r>
+          </w:p>
+        </w:tc>
+        <w:tc>
+          <w:tcPr>
+            <w:tcW w:type="dxa" w:w="1872"/>
+            <w:shd w:val="clear" w:color="auto" w:fill="3A3F47"/>
+          </w:tcPr>
+          <w:p>
+            <w:r>
+              <w:rPr>
+                <w:b/>
+                <w:color w:val="FFFFFF"/>
+                <w:sz w:val="19"/>
+              </w:rPr>
+              <w:t>Survey</w:t>
+            </w:r>
+          </w:p>
+        </w:tc>
+        <w:tc>
+          <w:tcPr>
+            <w:tcW w:type="dxa" w:w="3600"/>
+            <w:shd w:val="clear" w:color="auto" w:fill="3A3F47"/>
+          </w:tcPr>
+          <w:p>
+            <w:r>
+              <w:rPr>
+                <w:b/>
+                <w:color w:val="FFFFFF"/>
+                <w:sz w:val="19"/>
+              </w:rPr>
+              <w:t>Notes</w:t>
+            </w:r>
+          </w:p>
+        </w:tc>
+      </w:tr>
+      <w:tr>
+        <w:tc>
+          <w:tcPr>
+            <w:tcW w:type="dxa" w:w="720"/>
+          </w:tcPr>
+          <w:p>
+            <w:r>
+              <w:rPr>
+                <w:b w:val="0"/>
+                <w:sz w:val="19"/>
+              </w:rPr>
+              <w:t xml:space="preserve">13.1</w:t>
+            </w:r>
+          </w:p>
+        </w:tc>
+        <w:tc>
+          <w:tcPr>
+            <w:tcW w:type="dxa" w:w="2592"/>
+          </w:tcPr>
+          <w:p>
+            <w:r>
+              <w:rPr>
+                <w:b w:val="0"/>
+                <w:sz w:val="19"/>
+              </w:rPr>
+              <w:t xml:space="preserve">Sounds attached to recordings</w:t>
+            </w:r>
+          </w:p>
+        </w:tc>
+        <w:tc>
+          <w:tcPr>
+            <w:tcW w:type="dxa" w:w="3888"/>
+          </w:tcPr>
+          <w:p>
+            <w:r>
+              <w:rPr>
+                <w:b w:val="0"/>
+                <w:sz w:val="19"/>
+              </w:rPr>
+              <w:t xml:space="preserve">Session posts record the pedals and settings used, with a "load this sound" button; leave out</w:t>
+            </w:r>
+          </w:p>
+        </w:tc>
+        <w:tc>
+          <w:tcPr>
+            <w:tcW w:type="dxa" w:w="1152"/>
+            <w:shd w:val="clear" w:color="auto" w:fill="FDE2E1"/>
+          </w:tcPr>
+          <w:p>
+            <w:r>
+              <w:rPr>
+                <w:b w:val="0"/>
+                <w:sz w:val="19"/>
+              </w:rPr>
+              <w:t xml:space="preserve">Open</w:t>
+            </w:r>
+          </w:p>
+        </w:tc>
+        <w:tc>
+          <w:tcPr>
+            <w:tcW w:type="dxa" w:w="1872"/>
+          </w:tcPr>
+          <w:p>
+            <w:r>
+              <w:rPr>
+                <w:b w:val="0"/>
+                <w:sz w:val="19"/>
+              </w:rPr>
+              <w:t xml:space="preserve">Yes</w:t>
+            </w:r>
+          </w:p>
+        </w:tc>
+        <w:tc>
+          <w:tcPr>
+            <w:tcW w:type="dxa" w:w="3600"/>
+          </w:tcPr>
+          <w:p>
+            <w:r>
+              <w:rPr>
+                <w:b w:val="0"/>
+                <w:sz w:val="19"/>
+              </w:rPr>
+              <w:t xml:space="preserve">Settings only, with audio uploaded separately. Check against the Fender patent (8.6)</w:t>
+            </w:r>
+          </w:p>
+        </w:tc>
+      </w:tr>
+      <w:tr>
+        <w:tc>
+          <w:tcPr>
+            <w:tcW w:type="dxa" w:w="720"/>
+          </w:tcPr>
+          <w:p>
+            <w:r>
+              <w:rPr>
+                <w:b w:val="0"/>
+                <w:sz w:val="19"/>
+              </w:rPr>
+              <w:t xml:space="preserve">13.2</w:t>
+            </w:r>
+          </w:p>
+        </w:tc>
+        <w:tc>
+          <w:tcPr>
+            <w:tcW w:type="dxa" w:w="2592"/>
+          </w:tcPr>
+          <w:p>
+            <w:r>
+              <w:rPr>
+                <w:b w:val="0"/>
+                <w:sz w:val="19"/>
+              </w:rPr>
+              <w:t xml:space="preserve">Sound links in chat</w:t>
+            </w:r>
+          </w:p>
+        </w:tc>
+        <w:tc>
+          <w:tcPr>
+            <w:tcW w:type="dxa" w:w="3888"/>
+          </w:tcPr>
+          <w:p>
+            <w:r>
+              <w:rPr>
+                <w:b w:val="0"/>
+                <w:sz w:val="19"/>
+              </w:rPr>
+              <w:t xml:space="preserve">Links that load a sound onto your pedals; no links</w:t>
+            </w:r>
+          </w:p>
+        </w:tc>
+        <w:tc>
+          <w:tcPr>
+            <w:tcW w:type="dxa" w:w="1152"/>
+            <w:shd w:val="clear" w:color="auto" w:fill="FDE2E1"/>
+          </w:tcPr>
+          <w:p>
+            <w:r>
+              <w:rPr>
+                <w:b w:val="0"/>
+                <w:sz w:val="19"/>
+              </w:rPr>
+              <w:t xml:space="preserve">Open</w:t>
+            </w:r>
+          </w:p>
+        </w:tc>
+        <w:tc>
+          <w:tcPr>
+            <w:tcW w:type="dxa" w:w="1872"/>
+          </w:tcPr>
+          <w:p>
+            <w:r>
+              <w:rPr>
+                <w:b w:val="0"/>
+                <w:sz w:val="19"/>
+              </w:rPr>
+              <w:t xml:space="preserve">Yes</w:t>
+            </w:r>
+          </w:p>
+        </w:tc>
+        <w:tc>
+          <w:tcPr>
+            <w:tcW w:type="dxa" w:w="3600"/>
+          </w:tcPr>
+          <w:p>
+            <w:r>
+              <w:rPr>
+                <w:b w:val="0"/>
+                <w:sz w:val="19"/>
+              </w:rPr>
+              <w:t xml:space="preserve">Related to preset sharing in 10.3</w:t>
+            </w:r>
+          </w:p>
+        </w:tc>
+      </w:tr>
+      <w:tr>
+        <w:tc>
+          <w:tcPr>
+            <w:tcW w:type="dxa" w:w="720"/>
+          </w:tcPr>
+          <w:p>
+            <w:r>
+              <w:rPr>
+                <w:b w:val="0"/>
+                <w:sz w:val="19"/>
+              </w:rPr>
+              <w:t xml:space="preserve">13.3</w:t>
+            </w:r>
+          </w:p>
+        </w:tc>
+        <w:tc>
+          <w:tcPr>
+            <w:tcW w:type="dxa" w:w="2592"/>
+          </w:tcPr>
+          <w:p>
+            <w:r>
+              <w:rPr>
+                <w:b w:val="0"/>
+                <w:sz w:val="19"/>
+              </w:rPr>
+              <w:t xml:space="preserve">Translated sounds</w:t>
+            </w:r>
+          </w:p>
+        </w:tc>
+        <w:tc>
+          <w:tcPr>
+            <w:tcW w:type="dxa" w:w="3888"/>
+          </w:tcPr>
+          <w:p>
+            <w:r>
+              <w:rPr>
+                <w:b w:val="0"/>
+                <w:sz w:val="19"/>
+              </w:rPr>
+              <w:t xml:space="preserve">Load a sound onto whichever pedals you own, with a note about anything missing; exact pedals only</w:t>
+            </w:r>
+          </w:p>
+        </w:tc>
+        <w:tc>
+          <w:tcPr>
+            <w:tcW w:type="dxa" w:w="1152"/>
+            <w:shd w:val="clear" w:color="auto" w:fill="FDE2E1"/>
+          </w:tcPr>
+          <w:p>
+            <w:r>
+              <w:rPr>
+                <w:b w:val="0"/>
+                <w:sz w:val="19"/>
+              </w:rPr>
+              <w:t xml:space="preserve">Open</w:t>
+            </w:r>
+          </w:p>
+        </w:tc>
+        <w:tc>
+          <w:tcPr>
+            <w:tcW w:type="dxa" w:w="1872"/>
+          </w:tcPr>
+          <w:p>
+            <w:r>
+              <w:rPr>
+                <w:b w:val="0"/>
+                <w:sz w:val="19"/>
+              </w:rPr>
+              <w:t xml:space="preserve">Partly</w:t>
+            </w:r>
+          </w:p>
+        </w:tc>
+        <w:tc>
+          <w:tcPr>
+            <w:tcW w:type="dxa" w:w="3600"/>
+          </w:tcPr>
+          <w:p>
+            <w:r>
+              <w:rPr>
+                <w:b w:val="0"/>
+                <w:sz w:val="19"/>
+              </w:rPr>
+              <w:t xml:space="preserve">Depends on 13.1 or 13.2</w:t>
+            </w:r>
+          </w:p>
+        </w:tc>
+      </w:tr>
+      <w:tr>
+        <w:tc>
+          <w:tcPr>
+            <w:tcW w:type="dxa" w:w="720"/>
+          </w:tcPr>
+          <w:p>
+            <w:r>
+              <w:rPr>
+                <w:b w:val="0"/>
+                <w:sz w:val="19"/>
+              </w:rPr>
+              <w:t xml:space="preserve">13.4</w:t>
+            </w:r>
+          </w:p>
+        </w:tc>
+        <w:tc>
+          <w:tcPr>
+            <w:tcW w:type="dxa" w:w="2592"/>
+          </w:tcPr>
+          <w:p>
+            <w:r>
+              <w:rPr>
+                <w:b w:val="0"/>
+                <w:sz w:val="19"/>
+              </w:rPr>
+              <w:t xml:space="preserve">Shared band setlists</w:t>
+            </w:r>
+          </w:p>
+        </w:tc>
+        <w:tc>
+          <w:tcPr>
+            <w:tcW w:type="dxa" w:w="3888"/>
+          </w:tcPr>
+          <w:p>
+            <w:r>
+              <w:rPr>
+                <w:b w:val="0"/>
+                <w:sz w:val="19"/>
+              </w:rPr>
+              <w:t xml:space="preserve">Setlist on the band's page that syncs to each member's Switchyard; each member manages their own</w:t>
+            </w:r>
+          </w:p>
+        </w:tc>
+        <w:tc>
+          <w:tcPr>
+            <w:tcW w:type="dxa" w:w="1152"/>
+            <w:shd w:val="clear" w:color="auto" w:fill="FDE2E1"/>
+          </w:tcPr>
+          <w:p>
+            <w:r>
+              <w:rPr>
+                <w:b w:val="0"/>
+                <w:sz w:val="19"/>
+              </w:rPr>
+              <w:t xml:space="preserve">Open</w:t>
+            </w:r>
+          </w:p>
+        </w:tc>
+        <w:tc>
+          <w:tcPr>
+            <w:tcW w:type="dxa" w:w="1872"/>
+          </w:tcPr>
+          <w:p>
+            <w:r>
+              <w:rPr>
+                <w:b w:val="0"/>
+                <w:sz w:val="19"/>
+              </w:rPr>
+              <w:t xml:space="preserve">Yes</w:t>
+            </w:r>
+          </w:p>
+        </w:tc>
+        <w:tc>
+          <w:tcPr>
+            <w:tcW w:type="dxa" w:w="3600"/>
+          </w:tcPr>
+          <w:p>
+            <w:r>
+              <w:rPr>
+                <w:b w:val="0"/>
+                <w:sz w:val="19"/>
+              </w:rPr>
+              <w:t xml:space="preserve">Syncs ahead of time, then works offline at the gig</w:t>
+            </w:r>
+          </w:p>
+        </w:tc>
+      </w:tr>
+      <w:tr>
+        <w:tc>
+          <w:tcPr>
+            <w:tcW w:type="dxa" w:w="720"/>
+          </w:tcPr>
+          <w:p>
+            <w:r>
+              <w:rPr>
+                <w:b w:val="0"/>
+                <w:sz w:val="19"/>
+              </w:rPr>
+              <w:t xml:space="preserve">13.5</w:t>
+            </w:r>
+          </w:p>
+        </w:tc>
+        <w:tc>
+          <w:tcPr>
+            <w:tcW w:type="dxa" w:w="2592"/>
+          </w:tcPr>
+          <w:p>
+            <w:r>
+              <w:rPr>
+                <w:b w:val="0"/>
+                <w:sz w:val="19"/>
+              </w:rPr>
+              <w:t xml:space="preserve">Song pages</w:t>
+            </w:r>
+          </w:p>
+        </w:tc>
+        <w:tc>
+          <w:tcPr>
+            <w:tcW w:type="dxa" w:w="3888"/>
+          </w:tcPr>
+          <w:p>
+            <w:r>
+              <w:rPr>
+                <w:b w:val="0"/>
+                <w:sz w:val="19"/>
+              </w:rPr>
+              <w:t xml:space="preserve">One page with practice recordings, the setlist entry and each member's sounds; keep them separate</w:t>
+            </w:r>
+          </w:p>
+        </w:tc>
+        <w:tc>
+          <w:tcPr>
+            <w:tcW w:type="dxa" w:w="1152"/>
+            <w:shd w:val="clear" w:color="auto" w:fill="FDE2E1"/>
+          </w:tcPr>
+          <w:p>
+            <w:r>
+              <w:rPr>
+                <w:b w:val="0"/>
+                <w:sz w:val="19"/>
+              </w:rPr>
+              <w:t xml:space="preserve">Open</w:t>
+            </w:r>
+          </w:p>
+        </w:tc>
+        <w:tc>
+          <w:tcPr>
+            <w:tcW w:type="dxa" w:w="1872"/>
+          </w:tcPr>
+          <w:p>
+            <w:r>
+              <w:rPr>
+                <w:b w:val="0"/>
+                <w:sz w:val="19"/>
+              </w:rPr>
+              <w:t xml:space="preserve">Yes</w:t>
+            </w:r>
+          </w:p>
+        </w:tc>
+        <w:tc>
+          <w:tcPr>
+            <w:tcW w:type="dxa" w:w="3600"/>
+          </w:tcPr>
+          <w:p>
+            <w:r>
+              <w:rPr>
+                <w:b w:val="0"/>
+                <w:sz w:val="19"/>
+              </w:rPr>
+              <w:t xml:space="preserve">Builds on Sessions, Bands and 13.4</w:t>
+            </w:r>
+          </w:p>
+        </w:tc>
+      </w:tr>
+      <w:tr>
+        <w:tc>
+          <w:tcPr>
+            <w:tcW w:type="dxa" w:w="720"/>
+          </w:tcPr>
+          <w:p>
+            <w:r>
+              <w:rPr>
+                <w:b w:val="0"/>
+                <w:sz w:val="19"/>
+              </w:rPr>
+              <w:t xml:space="preserve">13.6</w:t>
+            </w:r>
+          </w:p>
+        </w:tc>
+        <w:tc>
+          <w:tcPr>
+            <w:tcW w:type="dxa" w:w="2592"/>
+          </w:tcPr>
+          <w:p>
+            <w:r>
+              <w:rPr>
+                <w:b w:val="0"/>
+                <w:sz w:val="19"/>
+              </w:rPr>
+              <w:t xml:space="preserve">Rehearsal follow-along</w:t>
+            </w:r>
+          </w:p>
+        </w:tc>
+        <w:tc>
+          <w:tcPr>
+            <w:tcW w:type="dxa" w:w="3888"/>
+          </w:tcPr>
+          <w:p>
+            <w:r>
+              <w:rPr>
+                <w:b w:val="0"/>
+                <w:sz w:val="19"/>
+              </w:rPr>
+              <w:t xml:space="preserve">Your footswitch moves bandmates' phones to the matching lyrics or chords; leave out</w:t>
+            </w:r>
+          </w:p>
+        </w:tc>
+        <w:tc>
+          <w:tcPr>
+            <w:tcW w:type="dxa" w:w="1152"/>
+            <w:shd w:val="clear" w:color="auto" w:fill="FDE2E1"/>
+          </w:tcPr>
+          <w:p>
+            <w:r>
+              <w:rPr>
+                <w:b w:val="0"/>
+                <w:sz w:val="19"/>
+              </w:rPr>
+              <w:t xml:space="preserve">Open</w:t>
+            </w:r>
+          </w:p>
+        </w:tc>
+        <w:tc>
+          <w:tcPr>
+            <w:tcW w:type="dxa" w:w="1872"/>
+          </w:tcPr>
+          <w:p>
+            <w:r>
+              <w:rPr>
+                <w:b w:val="0"/>
+                <w:sz w:val="19"/>
+              </w:rPr>
+              <w:t xml:space="preserve">Yes</w:t>
+            </w:r>
+          </w:p>
+        </w:tc>
+        <w:tc>
+          <w:tcPr>
+            <w:tcW w:type="dxa" w:w="3600"/>
+          </w:tcPr>
+          <w:p>
+            <w:r>
+              <w:rPr>
+                <w:b w:val="0"/>
+                <w:sz w:val="19"/>
+              </w:rPr>
+              <w:t xml:space="preserve">Has to run locally, not over the internet</w:t>
+            </w:r>
+          </w:p>
+        </w:tc>
+      </w:tr>
+      <w:tr>
+        <w:tc>
+          <w:tcPr>
+            <w:tcW w:type="dxa" w:w="720"/>
+          </w:tcPr>
+          <w:p>
+            <w:r>
+              <w:rPr>
+                <w:b w:val="0"/>
+                <w:sz w:val="19"/>
+              </w:rPr>
+              <w:t xml:space="preserve">13.7</w:t>
+            </w:r>
+          </w:p>
+        </w:tc>
+        <w:tc>
+          <w:tcPr>
+            <w:tcW w:type="dxa" w:w="2592"/>
+          </w:tcPr>
+          <w:p>
+            <w:r>
+              <w:rPr>
+                <w:b w:val="0"/>
+                <w:sz w:val="19"/>
+              </w:rPr>
+              <w:t xml:space="preserve">Pedalboard on your profile</w:t>
+            </w:r>
+          </w:p>
+        </w:tc>
+        <w:tc>
+          <w:tcPr>
+            <w:tcW w:type="dxa" w:w="3888"/>
+          </w:tcPr>
+          <w:p>
+            <w:r>
+              <w:rPr>
+                <w:b w:val="0"/>
+                <w:sz w:val="19"/>
+              </w:rPr>
+              <w:t xml:space="preserve">Filled in automatically through Switchyard; typed by hand; leave out</w:t>
+            </w:r>
+          </w:p>
+        </w:tc>
+        <w:tc>
+          <w:tcPr>
+            <w:tcW w:type="dxa" w:w="1152"/>
+            <w:shd w:val="clear" w:color="auto" w:fill="FDE2E1"/>
+          </w:tcPr>
+          <w:p>
+            <w:r>
+              <w:rPr>
+                <w:b w:val="0"/>
+                <w:sz w:val="19"/>
+              </w:rPr>
+              <w:t xml:space="preserve">Open</w:t>
+            </w:r>
+          </w:p>
+        </w:tc>
+        <w:tc>
+          <w:tcPr>
+            <w:tcW w:type="dxa" w:w="1872"/>
+          </w:tcPr>
+          <w:p>
+            <w:r>
+              <w:rPr>
+                <w:b w:val="0"/>
+                <w:sz w:val="19"/>
+              </w:rPr>
+              <w:t xml:space="preserve">Yes</w:t>
+            </w:r>
+          </w:p>
+        </w:tc>
+        <w:tc>
+          <w:tcPr>
+            <w:tcW w:type="dxa" w:w="3600"/>
+          </w:tcPr>
+          <w:p>
+            <w:r>
+              <w:rPr>
+                <w:b w:val="0"/>
+                <w:sz w:val="19"/>
+              </w:rPr>
+              <w:t xml:space="preserve">Also allows searches like "Flashover owners near me"</w:t>
+            </w:r>
+          </w:p>
+        </w:tc>
+      </w:tr>
+      <w:tr>
+        <w:tc>
+          <w:tcPr>
+            <w:tcW w:type="dxa" w:w="720"/>
+          </w:tcPr>
+          <w:p>
+            <w:r>
+              <w:rPr>
+                <w:b w:val="0"/>
+                <w:sz w:val="19"/>
+              </w:rPr>
+              <w:t xml:space="preserve">13.8</w:t>
+            </w:r>
+          </w:p>
+        </w:tc>
+        <w:tc>
+          <w:tcPr>
+            <w:tcW w:type="dxa" w:w="2592"/>
+          </w:tcPr>
+          <w:p>
+            <w:r>
+              <w:rPr>
+                <w:b w:val="0"/>
+                <w:sz w:val="19"/>
+              </w:rPr>
+              <w:t xml:space="preserve">A page for each pedal</w:t>
+            </w:r>
+          </w:p>
+        </w:tc>
+        <w:tc>
+          <w:tcPr>
+            <w:tcW w:type="dxa" w:w="3888"/>
+          </w:tcPr>
+          <w:p>
+            <w:r>
+              <w:rPr>
+                <w:b w:val="0"/>
+                <w:sz w:val="19"/>
+              </w:rPr>
+              <w:t xml:space="preserve">Public; visible to the owner only; leave out</w:t>
+            </w:r>
+          </w:p>
+        </w:tc>
+        <w:tc>
+          <w:tcPr>
+            <w:tcW w:type="dxa" w:w="1152"/>
+            <w:shd w:val="clear" w:color="auto" w:fill="FDE2E1"/>
+          </w:tcPr>
+          <w:p>
+            <w:r>
+              <w:rPr>
+                <w:b w:val="0"/>
+                <w:sz w:val="19"/>
+              </w:rPr>
+              <w:t xml:space="preserve">Open</w:t>
+            </w:r>
+          </w:p>
+        </w:tc>
+        <w:tc>
+          <w:tcPr>
+            <w:tcW w:type="dxa" w:w="1872"/>
+          </w:tcPr>
+          <w:p>
+            <w:r>
+              <w:rPr>
+                <w:b w:val="0"/>
+                <w:sz w:val="19"/>
+              </w:rPr>
+              <w:t xml:space="preserve">Partly</w:t>
+            </w:r>
+          </w:p>
+        </w:tc>
+        <w:tc>
+          <w:tcPr>
+            <w:tcW w:type="dxa" w:w="3600"/>
+          </w:tcPr>
+          <w:p>
+            <w:r>
+              <w:rPr>
+                <w:b w:val="0"/>
+                <w:sz w:val="19"/>
+              </w:rPr>
+              <w:t xml:space="preserve">Build date, batch, firmware history and ownership</w:t>
+            </w:r>
+          </w:p>
+        </w:tc>
+      </w:tr>
+      <w:tr>
+        <w:tc>
+          <w:tcPr>
+            <w:tcW w:type="dxa" w:w="720"/>
+          </w:tcPr>
+          <w:p>
+            <w:r>
+              <w:rPr>
+                <w:b w:val="0"/>
+                <w:sz w:val="19"/>
+              </w:rPr>
+              <w:t xml:space="preserve">13.9</w:t>
+            </w:r>
+          </w:p>
+        </w:tc>
+        <w:tc>
+          <w:tcPr>
+            <w:tcW w:type="dxa" w:w="2592"/>
+          </w:tcPr>
+          <w:p>
+            <w:r>
+              <w:rPr>
+                <w:b w:val="0"/>
+                <w:sz w:val="19"/>
+              </w:rPr>
+              <w:t xml:space="preserve">Resale and theft checks</w:t>
+            </w:r>
+          </w:p>
+        </w:tc>
+        <w:tc>
+          <w:tcPr>
+            <w:tcW w:type="dxa" w:w="3888"/>
+          </w:tcPr>
+          <w:p>
+            <w:r>
+              <w:rPr>
+                <w:b w:val="0"/>
+                <w:sz w:val="19"/>
+              </w:rPr>
+              <w:t xml:space="preserve">Serial lookup plus a stolen flag; transfers only; leave out</w:t>
+            </w:r>
+          </w:p>
+        </w:tc>
+        <w:tc>
+          <w:tcPr>
+            <w:tcW w:type="dxa" w:w="1152"/>
+            <w:shd w:val="clear" w:color="auto" w:fill="FDE2E1"/>
+          </w:tcPr>
+          <w:p>
+            <w:r>
+              <w:rPr>
+                <w:b w:val="0"/>
+                <w:sz w:val="19"/>
+              </w:rPr>
+              <w:t xml:space="preserve">Open</w:t>
+            </w:r>
+          </w:p>
+        </w:tc>
+        <w:tc>
+          <w:tcPr>
+            <w:tcW w:type="dxa" w:w="1872"/>
+          </w:tcPr>
+          <w:p>
+            <w:r>
+              <w:rPr>
+                <w:b w:val="0"/>
+                <w:sz w:val="19"/>
+              </w:rPr>
+              <w:t xml:space="preserve">Yes</w:t>
+            </w:r>
+          </w:p>
+        </w:tc>
+        <w:tc>
+          <w:tcPr>
+            <w:tcW w:type="dxa" w:w="3600"/>
+          </w:tcPr>
+          <w:p>
+            <w:r>
+              <w:rPr>
+                <w:b w:val="0"/>
+                <w:sz w:val="19"/>
+              </w:rPr>
+              <w:t xml:space="preserve">A flagged pedal can't be claimed, and a sale transfers the serial. Depends on 13.17</w:t>
+            </w:r>
+          </w:p>
+        </w:tc>
+      </w:tr>
+      <w:tr>
+        <w:tc>
+          <w:tcPr>
+            <w:tcW w:type="dxa" w:w="720"/>
+          </w:tcPr>
+          <w:p>
+            <w:r>
+              <w:rPr>
+                <w:b w:val="0"/>
+                <w:sz w:val="19"/>
+              </w:rPr>
+              <w:t xml:space="preserve">13.10</w:t>
+            </w:r>
+          </w:p>
+        </w:tc>
+        <w:tc>
+          <w:tcPr>
+            <w:tcW w:type="dxa" w:w="2592"/>
+          </w:tcPr>
+          <w:p>
+            <w:r>
+              <w:rPr>
+                <w:b w:val="0"/>
+                <w:sz w:val="19"/>
+              </w:rPr>
+              <w:t xml:space="preserve">Warranty and support through the site</w:t>
+            </w:r>
+          </w:p>
+        </w:tc>
+        <w:tc>
+          <w:tcPr>
+            <w:tcW w:type="dxa" w:w="3888"/>
+          </w:tcPr>
+          <w:p>
+            <w:r>
+              <w:rPr>
+                <w:b w:val="0"/>
+                <w:sz w:val="19"/>
+              </w:rPr>
+              <w:t xml:space="preserve">Claiming registers the warranty and support requests include pedal diagnostics; handle by email</w:t>
+            </w:r>
+          </w:p>
+        </w:tc>
+        <w:tc>
+          <w:tcPr>
+            <w:tcW w:type="dxa" w:w="1152"/>
+            <w:shd w:val="clear" w:color="auto" w:fill="FDE2E1"/>
+          </w:tcPr>
+          <w:p>
+            <w:r>
+              <w:rPr>
+                <w:b w:val="0"/>
+                <w:sz w:val="19"/>
+              </w:rPr>
+              <w:t xml:space="preserve">Open</w:t>
+            </w:r>
+          </w:p>
+        </w:tc>
+        <w:tc>
+          <w:tcPr>
+            <w:tcW w:type="dxa" w:w="1872"/>
+          </w:tcPr>
+          <w:p>
+            <w:r>
+              <w:rPr>
+                <w:b w:val="0"/>
+                <w:sz w:val="19"/>
+              </w:rPr>
+              <w:t xml:space="preserve">Partly</w:t>
+            </w:r>
+          </w:p>
+        </w:tc>
+        <w:tc>
+          <w:tcPr>
+            <w:tcW w:type="dxa" w:w="3600"/>
+          </w:tcPr>
+          <w:p>
+            <w:r>
+              <w:rPr>
+                <w:b w:val="0"/>
+                <w:sz w:val="19"/>
+              </w:rPr>
+              <w:t xml:space="preserve">Related to 11.1 and 11.4</w:t>
+            </w:r>
+          </w:p>
+        </w:tc>
+      </w:tr>
+      <w:tr>
+        <w:tc>
+          <w:tcPr>
+            <w:tcW w:type="dxa" w:w="720"/>
+          </w:tcPr>
+          <w:p>
+            <w:r>
+              <w:rPr>
+                <w:b w:val="0"/>
+                <w:sz w:val="19"/>
+              </w:rPr>
+              <w:t xml:space="preserve">13.11</w:t>
+            </w:r>
+          </w:p>
+        </w:tc>
+        <w:tc>
+          <w:tcPr>
+            <w:tcW w:type="dxa" w:w="2592"/>
+          </w:tcPr>
+          <w:p>
+            <w:r>
+              <w:rPr>
+                <w:b w:val="0"/>
+                <w:sz w:val="19"/>
+              </w:rPr>
+              <w:t xml:space="preserve">Browser editor</w:t>
+            </w:r>
+          </w:p>
+        </w:tc>
+        <w:tc>
+          <w:tcPr>
+            <w:tcW w:type="dxa" w:w="3888"/>
+          </w:tcPr>
+          <w:p>
+            <w:r>
+              <w:rPr>
+                <w:b w:val="0"/>
+                <w:sz w:val="19"/>
+              </w:rPr>
+              <w:t xml:space="preserve">Web page with knobs that follow the real ones, using </w:t>
+            </w:r>
+            <w:r>
+              <w:rPr>
+                <w:b/>
+                <w:sz w:val="19"/>
+              </w:rPr>
+              <w:t xml:space="preserve">Web MIDI</w:t>
+            </w:r>
+            <w:r>
+              <w:rPr>
+                <w:b w:val="0"/>
+                <w:sz w:val="19"/>
+              </w:rPr>
+              <w:t xml:space="preserve">; app only</w:t>
+            </w:r>
+          </w:p>
+        </w:tc>
+        <w:tc>
+          <w:tcPr>
+            <w:tcW w:type="dxa" w:w="1152"/>
+            <w:shd w:val="clear" w:color="auto" w:fill="FDE2E1"/>
+          </w:tcPr>
+          <w:p>
+            <w:r>
+              <w:rPr>
+                <w:b w:val="0"/>
+                <w:sz w:val="19"/>
+              </w:rPr>
+              <w:t xml:space="preserve">Open</w:t>
+            </w:r>
+          </w:p>
+        </w:tc>
+        <w:tc>
+          <w:tcPr>
+            <w:tcW w:type="dxa" w:w="1872"/>
+          </w:tcPr>
+          <w:p>
+            <w:r>
+              <w:rPr>
+                <w:b w:val="0"/>
+                <w:sz w:val="19"/>
+              </w:rPr>
+              <w:t xml:space="preserve">Yes</w:t>
+            </w:r>
+          </w:p>
+        </w:tc>
+        <w:tc>
+          <w:tcPr>
+            <w:tcW w:type="dxa" w:w="3600"/>
+          </w:tcPr>
+          <w:p>
+            <w:r>
+              <w:rPr>
+                <w:b w:val="0"/>
+                <w:sz w:val="19"/>
+              </w:rPr>
+              <w:t xml:space="preserve">Won't work on iPhone. Shares its read and load code with 13.1 and 13.2</w:t>
+            </w:r>
+          </w:p>
+        </w:tc>
+      </w:tr>
+      <w:tr>
+        <w:tc>
+          <w:tcPr>
+            <w:tcW w:type="dxa" w:w="720"/>
+          </w:tcPr>
+          <w:p>
+            <w:r>
+              <w:rPr>
+                <w:b w:val="0"/>
+                <w:sz w:val="19"/>
+              </w:rPr>
+              <w:t xml:space="preserve">13.12</w:t>
+            </w:r>
+          </w:p>
+        </w:tc>
+        <w:tc>
+          <w:tcPr>
+            <w:tcW w:type="dxa" w:w="2592"/>
+          </w:tcPr>
+          <w:p>
+            <w:r>
+              <w:rPr>
+                <w:b w:val="0"/>
+                <w:sz w:val="19"/>
+              </w:rPr>
+              <w:t xml:space="preserve">Remote help</w:t>
+            </w:r>
+          </w:p>
+        </w:tc>
+        <w:tc>
+          <w:tcPr>
+            <w:tcW w:type="dxa" w:w="3888"/>
+          </w:tcPr>
+          <w:p>
+            <w:r>
+              <w:rPr>
+                <w:b w:val="0"/>
+                <w:sz w:val="19"/>
+              </w:rPr>
+              <w:t xml:space="preserve">Friends and support can adjust your sound from a browser; support only; leave out</w:t>
+            </w:r>
+          </w:p>
+        </w:tc>
+        <w:tc>
+          <w:tcPr>
+            <w:tcW w:type="dxa" w:w="1152"/>
+            <w:shd w:val="clear" w:color="auto" w:fill="FDE2E1"/>
+          </w:tcPr>
+          <w:p>
+            <w:r>
+              <w:rPr>
+                <w:b w:val="0"/>
+                <w:sz w:val="19"/>
+              </w:rPr>
+              <w:t xml:space="preserve">Open</w:t>
+            </w:r>
+          </w:p>
+        </w:tc>
+        <w:tc>
+          <w:tcPr>
+            <w:tcW w:type="dxa" w:w="1872"/>
+          </w:tcPr>
+          <w:p>
+            <w:r>
+              <w:rPr>
+                <w:b w:val="0"/>
+                <w:sz w:val="19"/>
+              </w:rPr>
+              <w:t xml:space="preserve">Yes</w:t>
+            </w:r>
+          </w:p>
+        </w:tc>
+        <w:tc>
+          <w:tcPr>
+            <w:tcW w:type="dxa" w:w="3600"/>
+          </w:tcPr>
+          <w:p>
+            <w:r>
+              <w:rPr>
+                <w:b w:val="0"/>
+                <w:sz w:val="19"/>
+              </w:rPr>
+              <w:t xml:space="preserve">Only with the owner's permission</w:t>
+            </w:r>
+          </w:p>
+        </w:tc>
+      </w:tr>
+      <w:tr>
+        <w:tc>
+          <w:tcPr>
+            <w:tcW w:type="dxa" w:w="720"/>
+          </w:tcPr>
+          <w:p>
+            <w:r>
+              <w:rPr>
+                <w:b w:val="0"/>
+                <w:sz w:val="19"/>
+              </w:rPr>
+              <w:t xml:space="preserve">13.13</w:t>
+            </w:r>
+          </w:p>
+        </w:tc>
+        <w:tc>
+          <w:tcPr>
+            <w:tcW w:type="dxa" w:w="2592"/>
+          </w:tcPr>
+          <w:p>
+            <w:r>
+              <w:rPr>
+                <w:b w:val="0"/>
+                <w:sz w:val="19"/>
+              </w:rPr>
+              <w:t xml:space="preserve">Firmware updates in the community</w:t>
+            </w:r>
+          </w:p>
+        </w:tc>
+        <w:tc>
+          <w:tcPr>
+            <w:tcW w:type="dxa" w:w="3888"/>
+          </w:tcPr>
+          <w:p>
+            <w:r>
+              <w:rPr>
+                <w:b w:val="0"/>
+                <w:sz w:val="19"/>
+              </w:rPr>
+              <w:t xml:space="preserve">A discussion for each release plus alerts for out-of-date pedals; release notes only</w:t>
+            </w:r>
+          </w:p>
+        </w:tc>
+        <w:tc>
+          <w:tcPr>
+            <w:tcW w:type="dxa" w:w="1152"/>
+            <w:shd w:val="clear" w:color="auto" w:fill="FDE2E1"/>
+          </w:tcPr>
+          <w:p>
+            <w:r>
+              <w:rPr>
+                <w:b w:val="0"/>
+                <w:sz w:val="19"/>
+              </w:rPr>
+              <w:t xml:space="preserve">Open</w:t>
+            </w:r>
+          </w:p>
+        </w:tc>
+        <w:tc>
+          <w:tcPr>
+            <w:tcW w:type="dxa" w:w="1872"/>
+          </w:tcPr>
+          <w:p>
+            <w:r>
+              <w:rPr>
+                <w:b w:val="0"/>
+                <w:sz w:val="19"/>
+              </w:rPr>
+              <w:t xml:space="preserve">No</w:t>
+            </w:r>
+          </w:p>
+        </w:tc>
+        <w:tc>
+          <w:tcPr>
+            <w:tcW w:type="dxa" w:w="3600"/>
+          </w:tcPr>
+          <w:p>
+            <w:r>
+              <w:rPr>
+                <w:b w:val="0"/>
+                <w:sz w:val="19"/>
+              </w:rPr>
+              <w:t xml:space="preserve">Related to 11.6</w:t>
+            </w:r>
+          </w:p>
+        </w:tc>
+      </w:tr>
+      <w:tr>
+        <w:tc>
+          <w:tcPr>
+            <w:tcW w:type="dxa" w:w="720"/>
+          </w:tcPr>
+          <w:p>
+            <w:r>
+              <w:rPr>
+                <w:b w:val="0"/>
+                <w:sz w:val="19"/>
+              </w:rPr>
+              <w:t xml:space="preserve">13.14</w:t>
+            </w:r>
+          </w:p>
+        </w:tc>
+        <w:tc>
+          <w:tcPr>
+            <w:tcW w:type="dxa" w:w="2592"/>
+          </w:tcPr>
+          <w:p>
+            <w:r>
+              <w:rPr>
+                <w:b w:val="0"/>
+                <w:sz w:val="19"/>
+              </w:rPr>
+              <w:t xml:space="preserve">Opt-in usage stats</w:t>
+            </w:r>
+          </w:p>
+        </w:tc>
+        <w:tc>
+          <w:tcPr>
+            <w:tcW w:type="dxa" w:w="3888"/>
+          </w:tcPr>
+          <w:p>
+            <w:r>
+              <w:rPr>
+                <w:b w:val="0"/>
+                <w:sz w:val="19"/>
+              </w:rPr>
+              <w:t xml:space="preserve">Anonymous data on which modes and settings people use; collect nothing</w:t>
+            </w:r>
+          </w:p>
+        </w:tc>
+        <w:tc>
+          <w:tcPr>
+            <w:tcW w:type="dxa" w:w="1152"/>
+            <w:shd w:val="clear" w:color="auto" w:fill="FDE2E1"/>
+          </w:tcPr>
+          <w:p>
+            <w:r>
+              <w:rPr>
+                <w:b w:val="0"/>
+                <w:sz w:val="19"/>
+              </w:rPr>
+              <w:t xml:space="preserve">Open</w:t>
+            </w:r>
+          </w:p>
+        </w:tc>
+        <w:tc>
+          <w:tcPr>
+            <w:tcW w:type="dxa" w:w="1872"/>
+          </w:tcPr>
+          <w:p>
+            <w:r>
+              <w:rPr>
+                <w:b w:val="0"/>
+                <w:sz w:val="19"/>
+              </w:rPr>
+              <w:t xml:space="preserve">Yes</w:t>
+            </w:r>
+          </w:p>
+        </w:tc>
+        <w:tc>
+          <w:tcPr>
+            <w:tcW w:type="dxa" w:w="3600"/>
+          </w:tcPr>
+          <w:p>
+            <w:r>
+              <w:rPr>
+                <w:b w:val="0"/>
+                <w:sz w:val="19"/>
+              </w:rPr>
+              <w:t xml:space="preserve">Must match the privacy promise on the survey pages</w:t>
+            </w:r>
+          </w:p>
+        </w:tc>
+      </w:tr>
+      <w:tr>
+        <w:tc>
+          <w:tcPr>
+            <w:tcW w:type="dxa" w:w="720"/>
+          </w:tcPr>
+          <w:p>
+            <w:r>
+              <w:rPr>
+                <w:b w:val="0"/>
+                <w:sz w:val="19"/>
+              </w:rPr>
+              <w:t xml:space="preserve">13.15</w:t>
+            </w:r>
+          </w:p>
+        </w:tc>
+        <w:tc>
+          <w:tcPr>
+            <w:tcW w:type="dxa" w:w="2592"/>
+          </w:tcPr>
+          <w:p>
+            <w:r>
+              <w:rPr>
+                <w:b w:val="0"/>
+                <w:sz w:val="19"/>
+              </w:rPr>
+              <w:t xml:space="preserve">Vote, then test</w:t>
+            </w:r>
+          </w:p>
+        </w:tc>
+        <w:tc>
+          <w:tcPr>
+            <w:tcW w:type="dxa" w:w="3888"/>
+          </w:tcPr>
+          <w:p>
+            <w:r>
+              <w:rPr>
+                <w:b w:val="0"/>
+                <w:sz w:val="19"/>
+              </w:rPr>
+              <w:t xml:space="preserve">A survey picks a feature and owners of that pedal get beta firmware; no public betas</w:t>
+            </w:r>
+          </w:p>
+        </w:tc>
+        <w:tc>
+          <w:tcPr>
+            <w:tcW w:type="dxa" w:w="1152"/>
+            <w:shd w:val="clear" w:color="auto" w:fill="FDE2E1"/>
+          </w:tcPr>
+          <w:p>
+            <w:r>
+              <w:rPr>
+                <w:b w:val="0"/>
+                <w:sz w:val="19"/>
+              </w:rPr>
+              <w:t xml:space="preserve">Open</w:t>
+            </w:r>
+          </w:p>
+        </w:tc>
+        <w:tc>
+          <w:tcPr>
+            <w:tcW w:type="dxa" w:w="1872"/>
+          </w:tcPr>
+          <w:p>
+            <w:r>
+              <w:rPr>
+                <w:b w:val="0"/>
+                <w:sz w:val="19"/>
+              </w:rPr>
+              <w:t xml:space="preserve">Yes</w:t>
+            </w:r>
+          </w:p>
+        </w:tc>
+        <w:tc>
+          <w:tcPr>
+            <w:tcW w:type="dxa" w:w="3600"/>
+          </w:tcPr>
+          <w:p/>
+        </w:tc>
+      </w:tr>
+      <w:tr>
+        <w:tc>
+          <w:tcPr>
+            <w:tcW w:type="dxa" w:w="720"/>
+          </w:tcPr>
+          <w:p>
+            <w:r>
+              <w:rPr>
+                <w:b w:val="0"/>
+                <w:sz w:val="19"/>
+              </w:rPr>
+              <w:t xml:space="preserve">13.16</w:t>
+            </w:r>
+          </w:p>
+        </w:tc>
+        <w:tc>
+          <w:tcPr>
+            <w:tcW w:type="dxa" w:w="2592"/>
+          </w:tcPr>
+          <w:p>
+            <w:r>
+              <w:rPr>
+                <w:b w:val="0"/>
+                <w:sz w:val="19"/>
+              </w:rPr>
+              <w:t xml:space="preserve">Claiming with only a Flashover</w:t>
+            </w:r>
+          </w:p>
+        </w:tc>
+        <w:tc>
+          <w:tcPr>
+            <w:tcW w:type="dxa" w:w="3888"/>
+          </w:tcPr>
+          <w:p>
+            <w:r>
+              <w:rPr>
+                <w:b w:val="0"/>
+                <w:sz w:val="19"/>
+              </w:rPr>
+              <w:t xml:space="preserve">One-time code on a card in the box; TRS MIDI-to-USB cable; offer both</w:t>
+            </w:r>
+          </w:p>
+        </w:tc>
+        <w:tc>
+          <w:tcPr>
+            <w:tcW w:type="dxa" w:w="1152"/>
+            <w:shd w:val="clear" w:color="auto" w:fill="FDE2E1"/>
+          </w:tcPr>
+          <w:p>
+            <w:r>
+              <w:rPr>
+                <w:b w:val="0"/>
+                <w:sz w:val="19"/>
+              </w:rPr>
+              <w:t xml:space="preserve">Open</w:t>
+            </w:r>
+          </w:p>
+        </w:tc>
+        <w:tc>
+          <w:tcPr>
+            <w:tcW w:type="dxa" w:w="1872"/>
+          </w:tcPr>
+          <w:p>
+            <w:r>
+              <w:rPr>
+                <w:b w:val="0"/>
+                <w:sz w:val="19"/>
+              </w:rPr>
+              <w:t xml:space="preserve">Partly</w:t>
+            </w:r>
+          </w:p>
+        </w:tc>
+        <w:tc>
+          <w:tcPr>
+            <w:tcW w:type="dxa" w:w="3600"/>
+          </w:tcPr>
+          <w:p>
+            <w:r>
+              <w:rPr>
+                <w:b w:val="0"/>
+                <w:sz w:val="19"/>
+              </w:rPr>
+              <w:t xml:space="preserve">The Flashover docs checked show no USB port, and iPhones can't use Web MIDI</w:t>
+            </w:r>
+          </w:p>
+        </w:tc>
+      </w:tr>
+      <w:tr>
+        <w:tc>
+          <w:tcPr>
+            <w:tcW w:type="dxa" w:w="720"/>
+          </w:tcPr>
+          <w:p>
+            <w:r>
+              <w:rPr>
+                <w:b w:val="0"/>
+                <w:sz w:val="19"/>
+              </w:rPr>
+              <w:t xml:space="preserve">13.17</w:t>
+            </w:r>
+          </w:p>
+        </w:tc>
+        <w:tc>
+          <w:tcPr>
+            <w:tcW w:type="dxa" w:w="2592"/>
+          </w:tcPr>
+          <w:p>
+            <w:r>
+              <w:rPr>
+                <w:b w:val="0"/>
+                <w:sz w:val="19"/>
+              </w:rPr>
+              <w:t xml:space="preserve">Protecting serials from false claims</w:t>
+            </w:r>
+          </w:p>
+        </w:tc>
+        <w:tc>
+          <w:tcPr>
+            <w:tcW w:type="dxa" w:w="3888"/>
+          </w:tcPr>
+          <w:p>
+            <w:r>
+              <w:rPr>
+                <w:b w:val="0"/>
+                <w:sz w:val="19"/>
+              </w:rPr>
+              <w:t xml:space="preserve">Require the serial plus a code from the box; serial only (how it works today)</w:t>
+            </w:r>
+          </w:p>
+        </w:tc>
+        <w:tc>
+          <w:tcPr>
+            <w:tcW w:type="dxa" w:w="1152"/>
+            <w:shd w:val="clear" w:color="auto" w:fill="FDE2E1"/>
+          </w:tcPr>
+          <w:p>
+            <w:r>
+              <w:rPr>
+                <w:b w:val="0"/>
+                <w:sz w:val="19"/>
+              </w:rPr>
+              <w:t xml:space="preserve">Open</w:t>
+            </w:r>
+          </w:p>
+        </w:tc>
+        <w:tc>
+          <w:tcPr>
+            <w:tcW w:type="dxa" w:w="1872"/>
+          </w:tcPr>
+          <w:p>
+            <w:r>
+              <w:rPr>
+                <w:b w:val="0"/>
+                <w:sz w:val="19"/>
+              </w:rPr>
+              <w:t xml:space="preserve">No</w:t>
+            </w:r>
+          </w:p>
+        </w:tc>
+        <w:tc>
+          <w:tcPr>
+            <w:tcW w:type="dxa" w:w="3600"/>
+          </w:tcPr>
+          <w:p>
+            <w:r>
+              <w:rPr>
+                <w:b w:val="0"/>
+                <w:sz w:val="19"/>
+              </w:rPr>
+              <w:t xml:space="preserve">Serials aren't secret, so anyone who sees one could claim it first. Matters most for 13.8–13.10 and paid effects (8.7). No security chip, as already decided</w:t>
+            </w:r>
+          </w:p>
+        </w:tc>
+      </w:tr>
+      <w:tr>
+        <w:tc>
+          <w:tcPr>
+            <w:tcW w:type="dxa" w:w="720"/>
+          </w:tcPr>
+          <w:p>
+            <w:r>
+              <w:rPr>
+                <w:b w:val="0"/>
+                <w:sz w:val="19"/>
+              </w:rPr>
+              <w:t xml:space="preserve">13.18</w:t>
+            </w:r>
+          </w:p>
+        </w:tc>
+        <w:tc>
+          <w:tcPr>
+            <w:tcW w:type="dxa" w:w="2592"/>
+          </w:tcPr>
+          <w:p>
+            <w:r>
+              <w:rPr>
+                <w:b w:val="0"/>
+                <w:sz w:val="19"/>
+              </w:rPr>
+              <w:t xml:space="preserve">Access after selling your only pedal</w:t>
+            </w:r>
+          </w:p>
+        </w:tc>
+        <w:tc>
+          <w:tcPr>
+            <w:tcW w:type="dxa" w:w="3888"/>
+          </w:tcPr>
+          <w:p>
+            <w:r>
+              <w:rPr>
+                <w:b w:val="0"/>
+                <w:sz w:val="19"/>
+              </w:rPr>
+              <w:t xml:space="preserve">Keep membership; lose it at transfer; a grace period</w:t>
+            </w:r>
+          </w:p>
+        </w:tc>
+        <w:tc>
+          <w:tcPr>
+            <w:tcW w:type="dxa" w:w="1152"/>
+            <w:shd w:val="clear" w:color="auto" w:fill="FDE2E1"/>
+          </w:tcPr>
+          <w:p>
+            <w:r>
+              <w:rPr>
+                <w:b w:val="0"/>
+                <w:sz w:val="19"/>
+              </w:rPr>
+              <w:t xml:space="preserve">Open</w:t>
+            </w:r>
+          </w:p>
+        </w:tc>
+        <w:tc>
+          <w:tcPr>
+            <w:tcW w:type="dxa" w:w="1872"/>
+          </w:tcPr>
+          <w:p>
+            <w:r>
+              <w:rPr>
+                <w:b w:val="0"/>
+                <w:sz w:val="19"/>
+              </w:rPr>
+              <w:t xml:space="preserve">Yes</w:t>
+            </w:r>
+          </w:p>
+        </w:tc>
+        <w:tc>
+          <w:tcPr>
+            <w:tcW w:type="dxa" w:w="3600"/>
+          </w:tcPr>
+          <w:p>
+            <w:r>
+              <w:rPr>
+                <w:b w:val="0"/>
+                <w:sz w:val="19"/>
+              </w:rPr>
+              <w:t xml:space="preserve">Needs a clear rule before 13.8–13.10</w:t>
+            </w:r>
+          </w:p>
+        </w:tc>
+      </w:tr>
+    </w:tbl>
     <w:p>
       <w:pPr>
         <w:pStyle w:val="Heading1"/>
@@ -9481,6 +11193,20 @@
           <w:b w:val="0"/>
         </w:rPr>
         <w:t xml:space="preserve"> the UK's own compliance mark, similar to CE.</w:t>
+      </w:r>
+    </w:p>
+    <w:p>
+      <w:r>
+        <w:rPr>
+          <w:b/>
+        </w:rPr>
+        <w:t>Web MIDI:</w:t>
+      </w:r>
+      <w:r>
+        <w:rPr>
+          <w:b w:val="0"/>
+        </w:rPr>
+        <w:t xml:space="preserve"> a browser feature that lets a web page talk directly to MIDI gear, with no app. Chrome, Edge and Firefox support it; Safari, and so the iPhone, does not.</w:t>
       </w:r>
     </w:p>
     <w:p>

</xml_diff>